<commit_message>
update the cv file
</commit_message>
<xml_diff>
--- a/public/cv/Mariyan_Marinov__CV.docx
+++ b/public/cv/Mariyan_Marinov__CV.docx
@@ -42,12 +42,31 @@
           <w:rPr>
             <w:rStyle w:val="Hyperlink"/>
           </w:rPr>
-          <w:t>linkedin.com/in/mariyanmarinov</w:t>
+          <w:t>linkedin.com/in/</w:t>
         </w:r>
+        <w:proofErr w:type="spellStart"/>
+        <w:r>
+          <w:rPr>
+            <w:rStyle w:val="Hyperlink"/>
+          </w:rPr>
+          <w:t>mariyanmarinov</w:t>
+        </w:r>
+        <w:proofErr w:type="spellEnd"/>
       </w:hyperlink>
       <w:r>
         <w:t xml:space="preserve"> | +359883359122</w:t>
       </w:r>
+      <w:r>
+        <w:t xml:space="preserve"> | </w:t>
+      </w:r>
+      <w:hyperlink r:id="rId7" w:history="1">
+        <w:r>
+          <w:rPr>
+            <w:rStyle w:val="Hyperlink"/>
+          </w:rPr>
+          <w:t>portfolio</w:t>
+        </w:r>
+      </w:hyperlink>
     </w:p>
     <w:p>
       <w:pPr>
@@ -65,7 +84,15 @@
         <w:t>4</w:t>
       </w:r>
       <w:r>
-        <w:t>+ years of experience delivering enterprise software, cloud-native platforms, distributed systems, data-intensive applications and AI-assisted engineering solutions. Demonstrated success designing and implementing solutions for Microsoft, KPMG, Fugro, Momentus Technologies and public-sector institutions.</w:t>
+        <w:t xml:space="preserve">+ years of experience delivering enterprise software, cloud-native platforms, distributed systems, data-intensive applications and AI-assisted engineering solutions. Demonstrated success designing and implementing solutions for Microsoft, KPMG, Fugro, </w:t>
+      </w:r>
+      <w:proofErr w:type="spellStart"/>
+      <w:r>
+        <w:t>Momentus</w:t>
+      </w:r>
+      <w:proofErr w:type="spellEnd"/>
+      <w:r>
+        <w:t xml:space="preserve"> Technologies and public-sector institutions.</w:t>
       </w:r>
     </w:p>
     <w:p>
@@ -112,7 +139,15 @@
     </w:p>
     <w:p>
       <w:r>
-        <w:t>Cloud platform analyzing road condition using image processing outputs and geospatial datasets. Owned feature delivery, architecture participation, mentoring and reporting solutions using AWS, PostGIS and ArcGIS technologies.</w:t>
+        <w:t xml:space="preserve">Cloud platform analyzing road condition using image processing outputs and geospatial datasets. Owned feature delivery, architecture participation, mentoring and reporting solutions using AWS, </w:t>
+      </w:r>
+      <w:proofErr w:type="spellStart"/>
+      <w:r>
+        <w:t>PostGIS</w:t>
+      </w:r>
+      <w:proofErr w:type="spellEnd"/>
+      <w:r>
+        <w:t xml:space="preserve"> and ArcGIS technologies.</w:t>
       </w:r>
     </w:p>
     <w:p>
@@ -129,15 +164,20 @@
         <w:t>– Offshore Wind Installation Monitoring</w:t>
       </w:r>
       <w:r>
-        <w:t xml:space="preserve"> </w:t>
-      </w:r>
-      <w:r>
-        <w:t>(for RWE)</w:t>
+        <w:t xml:space="preserve"> (for RWE)</w:t>
       </w:r>
     </w:p>
     <w:p>
       <w:r>
-        <w:t>Real-time distributed telemetry platform used during offshore wind turbine installation. Event-driven architecture using MQTT, Docker and TimescaleDB with vessel-to-shore synchronization.</w:t>
+        <w:t xml:space="preserve">Real-time distributed telemetry platform used during offshore wind turbine installation. Event-driven architecture using MQTT, Docker and </w:t>
+      </w:r>
+      <w:proofErr w:type="spellStart"/>
+      <w:r>
+        <w:t>TimescaleDB</w:t>
+      </w:r>
+      <w:proofErr w:type="spellEnd"/>
+      <w:r>
+        <w:t xml:space="preserve"> with vessel-to-shore synchronization.</w:t>
       </w:r>
     </w:p>
     <w:p>
@@ -157,8 +197,13 @@
       <w:pPr>
         <w:pStyle w:val="Heading2"/>
       </w:pPr>
+      <w:proofErr w:type="spellStart"/>
       <w:r>
-        <w:t>Momentus Technologies – Event &amp; Venue Platform</w:t>
+        <w:t>Momentus</w:t>
+      </w:r>
+      <w:proofErr w:type="spellEnd"/>
+      <w:r>
+        <w:t xml:space="preserve"> Technologies – Event &amp; Venue Platform</w:t>
       </w:r>
     </w:p>
     <w:p>
@@ -184,9 +229,22 @@
       </w:r>
     </w:p>
     <w:p>
-      <w:r>
-        <w:t>Momentus Technologies</w:t>
-      </w:r>
+      <w:hyperlink r:id="rId8" w:history="1">
+        <w:proofErr w:type="spellStart"/>
+        <w:r>
+          <w:rPr>
+            <w:rStyle w:val="Hyperlink"/>
+          </w:rPr>
+          <w:t>Momentus</w:t>
+        </w:r>
+        <w:proofErr w:type="spellEnd"/>
+        <w:r>
+          <w:rPr>
+            <w:rStyle w:val="Hyperlink"/>
+          </w:rPr>
+          <w:t xml:space="preserve"> Technologies</w:t>
+        </w:r>
+      </w:hyperlink>
     </w:p>
     <w:p>
       <w:r>
@@ -210,9 +268,14 @@
       </w:r>
     </w:p>
     <w:p>
-      <w:r>
-        <w:t>Sharp IT Ltd.</w:t>
-      </w:r>
+      <w:hyperlink r:id="rId9" w:history="1">
+        <w:r>
+          <w:rPr>
+            <w:rStyle w:val="Hyperlink"/>
+          </w:rPr>
+          <w:t>Sharp IT Ltd.</w:t>
+        </w:r>
+      </w:hyperlink>
     </w:p>
     <w:p>
       <w:r>
@@ -224,10 +287,7 @@
     </w:p>
     <w:p>
       <w:r>
-        <w:t xml:space="preserve">Founded and operated a consulting practice delivering enterprise software engineering, solution architecture, cloud modernization and technical leadership services. Worked </w:t>
-      </w:r>
-      <w:r>
-        <w:t>with Microsoft, KPMG, Fugro and PCG delivering distributed systems, geospatial platforms, data migration solutions and reporting applications.</w:t>
+        <w:t>Founded and operated a consulting practice delivering enterprise software engineering, solution architecture, cloud modernization and technical leadership services. Worked with Microsoft, KPMG, Fugro and PCG delivering distributed systems, geospatial platforms, data migration solutions and reporting applications.</w:t>
       </w:r>
     </w:p>
     <w:p>
@@ -239,9 +299,14 @@
       </w:r>
     </w:p>
     <w:p>
-      <w:r>
-        <w:t>Sirma Solutions</w:t>
-      </w:r>
+      <w:hyperlink r:id="rId10" w:history="1">
+        <w:r>
+          <w:rPr>
+            <w:rStyle w:val="Hyperlink"/>
+          </w:rPr>
+          <w:t>Sirma Solutions</w:t>
+        </w:r>
+      </w:hyperlink>
     </w:p>
     <w:p>
       <w:r>
@@ -265,9 +330,16 @@
       </w:r>
     </w:p>
     <w:p>
-      <w:r>
-        <w:t>Tarmin</w:t>
-      </w:r>
+      <w:hyperlink r:id="rId11" w:history="1">
+        <w:proofErr w:type="spellStart"/>
+        <w:r>
+          <w:rPr>
+            <w:rStyle w:val="Hyperlink"/>
+          </w:rPr>
+          <w:t>Tarmin</w:t>
+        </w:r>
+        <w:proofErr w:type="spellEnd"/>
+      </w:hyperlink>
     </w:p>
     <w:p>
       <w:r>
@@ -297,7 +369,15 @@
     </w:p>
     <w:p>
       <w:r>
-        <w:t>Developed enterprise applications for GridBank storage virtualization and analytics platform including desktop administration tools, web applications and data management interfaces.</w:t>
+        <w:t xml:space="preserve">Developed enterprise applications for </w:t>
+      </w:r>
+      <w:proofErr w:type="spellStart"/>
+      <w:r>
+        <w:t>GridBank</w:t>
+      </w:r>
+      <w:proofErr w:type="spellEnd"/>
+      <w:r>
+        <w:t xml:space="preserve"> storage virtualization and analytics platform including desktop administration tools, web applications and data management interfaces.</w:t>
       </w:r>
     </w:p>
     <w:p>
@@ -309,9 +389,16 @@
       </w:r>
     </w:p>
     <w:p>
-      <w:r>
-        <w:t>Fitibo</w:t>
-      </w:r>
+      <w:hyperlink r:id="rId12" w:history="1">
+        <w:proofErr w:type="spellStart"/>
+        <w:r>
+          <w:rPr>
+            <w:rStyle w:val="Hyperlink"/>
+          </w:rPr>
+          <w:t>Fitibo</w:t>
+        </w:r>
+        <w:proofErr w:type="spellEnd"/>
+      </w:hyperlink>
     </w:p>
     <w:p>
       <w:r>
@@ -371,7 +458,15 @@
     </w:p>
     <w:p>
       <w:r>
-        <w:t>Angular • React • Aurelia • KnockoutJS • JavaScript • TypeScript • Bootstrap • jQuery</w:t>
+        <w:t xml:space="preserve">Angular • React • Aurelia • </w:t>
+      </w:r>
+      <w:proofErr w:type="spellStart"/>
+      <w:r>
+        <w:t>KnockoutJS</w:t>
+      </w:r>
+      <w:proofErr w:type="spellEnd"/>
+      <w:r>
+        <w:t xml:space="preserve"> • JavaScript • TypeScript • Bootstrap • jQuery</w:t>
       </w:r>
     </w:p>
     <w:p>
@@ -412,7 +507,31 @@
     </w:p>
     <w:p>
       <w:r>
-        <w:t>SQL Server • PostgreSQL • TimescaleDB • Cassandra • PostGIS • GeoJSON • ArcGIS • Shapefiles</w:t>
+        <w:t xml:space="preserve">SQL Server • PostgreSQL • </w:t>
+      </w:r>
+      <w:proofErr w:type="spellStart"/>
+      <w:r>
+        <w:t>TimescaleDB</w:t>
+      </w:r>
+      <w:proofErr w:type="spellEnd"/>
+      <w:r>
+        <w:t xml:space="preserve"> • Cassandra • </w:t>
+      </w:r>
+      <w:proofErr w:type="spellStart"/>
+      <w:r>
+        <w:t>PostGIS</w:t>
+      </w:r>
+      <w:proofErr w:type="spellEnd"/>
+      <w:r>
+        <w:t xml:space="preserve"> • </w:t>
+      </w:r>
+      <w:proofErr w:type="spellStart"/>
+      <w:r>
+        <w:t>GeoJSON</w:t>
+      </w:r>
+      <w:proofErr w:type="spellEnd"/>
+      <w:r>
+        <w:t xml:space="preserve"> • ArcGIS • Shapefiles</w:t>
       </w:r>
     </w:p>
     <w:p>
@@ -425,7 +544,15 @@
     </w:p>
     <w:p>
       <w:r>
-        <w:t>RabbitMQ • MQTT • MassTransit • Microsoft Graph • REST APIs • Web Services</w:t>
+        <w:t xml:space="preserve">RabbitMQ • MQTT • </w:t>
+      </w:r>
+      <w:proofErr w:type="spellStart"/>
+      <w:r>
+        <w:t>MassTransit</w:t>
+      </w:r>
+      <w:proofErr w:type="spellEnd"/>
+      <w:r>
+        <w:t xml:space="preserve"> • Microsoft Graph • REST APIs • Web Services</w:t>
       </w:r>
     </w:p>
     <w:p>
@@ -460,8 +587,21 @@
       </w:r>
     </w:p>
     <w:p>
+      <w:proofErr w:type="spellStart"/>
       <w:r>
-        <w:t>Fachhochschule für Technik und Wirtschaft Berlin (2010)</w:t>
+        <w:t>Fachhochschule</w:t>
+      </w:r>
+      <w:proofErr w:type="spellEnd"/>
+      <w:r>
+        <w:t xml:space="preserve"> für Technik und </w:t>
+      </w:r>
+      <w:proofErr w:type="spellStart"/>
+      <w:r>
+        <w:t>Wirtschaft</w:t>
+      </w:r>
+      <w:proofErr w:type="spellEnd"/>
+      <w:r>
+        <w:t xml:space="preserve"> Berlin (2010)</w:t>
       </w:r>
     </w:p>
     <w:p>
@@ -482,7 +622,7 @@
             <wp:extent cx="943627" cy="943627"/>
             <wp:effectExtent l="0" t="0" r="8890" b="8890"/>
             <wp:docPr id="2" name="Picture 2" descr="AWS Certified Cloud Practitioner">
-              <a:hlinkClick xmlns:a="http://schemas.openxmlformats.org/drawingml/2006/main" r:id="rId7"/>
+              <a:hlinkClick xmlns:a="http://schemas.openxmlformats.org/drawingml/2006/main" r:id="rId13"/>
             </wp:docPr>
             <wp:cNvGraphicFramePr>
               <a:graphicFrameLocks xmlns:a="http://schemas.openxmlformats.org/drawingml/2006/main" noChangeAspect="1"/>
@@ -492,14 +632,14 @@
                 <pic:pic xmlns:pic="http://schemas.openxmlformats.org/drawingml/2006/picture">
                   <pic:nvPicPr>
                     <pic:cNvPr id="2" name="Picture 2" descr="AWS Certified Cloud Practitioner">
-                      <a:hlinkClick r:id="rId7"/>
+                      <a:hlinkClick r:id="rId13"/>
                     </pic:cNvPr>
                     <pic:cNvPicPr>
                       <a:picLocks noChangeAspect="1" noChangeArrowheads="1"/>
                     </pic:cNvPicPr>
                   </pic:nvPicPr>
                   <pic:blipFill>
-                    <a:blip r:embed="rId8" cstate="print">
+                    <a:blip r:embed="rId14" cstate="print">
                       <a:extLst>
                         <a:ext uri="{28A0092B-C50C-407E-A947-70E740481C1C}">
                           <a14:useLocalDpi xmlns:a14="http://schemas.microsoft.com/office/drawing/2010/main" val="0"/>
@@ -545,7 +685,7 @@
             <wp:extent cx="914400" cy="914400"/>
             <wp:effectExtent l="0" t="0" r="0" b="0"/>
             <wp:docPr id="1" name="Picture 1" descr="AWS Certified Developer – Associate badge image. Certification. Intermediate level. Issued by Amazon Web Services Training and Certification">
-              <a:hlinkClick xmlns:a="http://schemas.openxmlformats.org/drawingml/2006/main" r:id="rId9"/>
+              <a:hlinkClick xmlns:a="http://schemas.openxmlformats.org/drawingml/2006/main" r:id="rId15"/>
             </wp:docPr>
             <wp:cNvGraphicFramePr>
               <a:graphicFrameLocks xmlns:a="http://schemas.openxmlformats.org/drawingml/2006/main" noChangeAspect="1"/>
@@ -555,14 +695,14 @@
                 <pic:pic xmlns:pic="http://schemas.openxmlformats.org/drawingml/2006/picture">
                   <pic:nvPicPr>
                     <pic:cNvPr id="1" name="Picture 1" descr="AWS Certified Developer – Associate badge image. Certification. Intermediate level. Issued by Amazon Web Services Training and Certification">
-                      <a:hlinkClick r:id="rId9"/>
+                      <a:hlinkClick r:id="rId15"/>
                     </pic:cNvPr>
                     <pic:cNvPicPr>
                       <a:picLocks noChangeAspect="1" noChangeArrowheads="1"/>
                     </pic:cNvPicPr>
                   </pic:nvPicPr>
                   <pic:blipFill>
-                    <a:blip r:embed="rId10" cstate="print">
+                    <a:blip r:embed="rId16" cstate="print">
                       <a:extLst>
                         <a:ext uri="{28A0092B-C50C-407E-A947-70E740481C1C}">
                           <a14:useLocalDpi xmlns:a14="http://schemas.microsoft.com/office/drawing/2010/main" val="0"/>
@@ -605,7 +745,7 @@
             <wp:extent cx="922681" cy="922681"/>
             <wp:effectExtent l="0" t="0" r="0" b="0"/>
             <wp:docPr id="3" name="Picture 3" descr="AWS Partner: Accreditation (Technical) badge image. Learning. Issued by Amazon Web Services Training and Certification">
-              <a:hlinkClick xmlns:a="http://schemas.openxmlformats.org/drawingml/2006/main" r:id="rId11"/>
+              <a:hlinkClick xmlns:a="http://schemas.openxmlformats.org/drawingml/2006/main" r:id="rId17"/>
             </wp:docPr>
             <wp:cNvGraphicFramePr>
               <a:graphicFrameLocks xmlns:a="http://schemas.openxmlformats.org/drawingml/2006/main" noChangeAspect="1"/>
@@ -615,14 +755,14 @@
                 <pic:pic xmlns:pic="http://schemas.openxmlformats.org/drawingml/2006/picture">
                   <pic:nvPicPr>
                     <pic:cNvPr id="3" name="Picture 3" descr="AWS Partner: Accreditation (Technical) badge image. Learning. Issued by Amazon Web Services Training and Certification">
-                      <a:hlinkClick r:id="rId11"/>
+                      <a:hlinkClick r:id="rId17"/>
                     </pic:cNvPr>
                     <pic:cNvPicPr>
                       <a:picLocks noChangeAspect="1" noChangeArrowheads="1"/>
                     </pic:cNvPicPr>
                   </pic:nvPicPr>
                   <pic:blipFill>
-                    <a:blip r:embed="rId12" cstate="print">
+                    <a:blip r:embed="rId18" cstate="print">
                       <a:extLst>
                         <a:ext uri="{28A0092B-C50C-407E-A947-70E740481C1C}">
                           <a14:useLocalDpi xmlns:a14="http://schemas.microsoft.com/office/drawing/2010/main" val="0"/>
@@ -662,7 +802,7 @@
             <wp:extent cx="931985" cy="931985"/>
             <wp:effectExtent l="0" t="0" r="1905" b="0"/>
             <wp:docPr id="4" name="Picture 4">
-              <a:hlinkClick xmlns:a="http://schemas.openxmlformats.org/drawingml/2006/main" r:id="rId13"/>
+              <a:hlinkClick xmlns:a="http://schemas.openxmlformats.org/drawingml/2006/main" r:id="rId19"/>
             </wp:docPr>
             <wp:cNvGraphicFramePr>
               <a:graphicFrameLocks xmlns:a="http://schemas.openxmlformats.org/drawingml/2006/main" noChangeAspect="1"/>
@@ -672,14 +812,14 @@
                 <pic:pic xmlns:pic="http://schemas.openxmlformats.org/drawingml/2006/picture">
                   <pic:nvPicPr>
                     <pic:cNvPr id="4" name="Picture 4">
-                      <a:hlinkClick r:id="rId13"/>
+                      <a:hlinkClick r:id="rId19"/>
                     </pic:cNvPr>
                     <pic:cNvPicPr>
                       <a:picLocks noChangeAspect="1" noChangeArrowheads="1"/>
                     </pic:cNvPicPr>
                   </pic:nvPicPr>
                   <pic:blipFill>
-                    <a:blip r:embed="rId14" cstate="print">
+                    <a:blip r:embed="rId20" cstate="print">
                       <a:extLst>
                         <a:ext uri="{28A0092B-C50C-407E-A947-70E740481C1C}">
                           <a14:useLocalDpi xmlns:a14="http://schemas.microsoft.com/office/drawing/2010/main" val="0"/>
@@ -719,7 +859,7 @@
             <wp:extent cx="1017814" cy="685574"/>
             <wp:effectExtent l="0" t="0" r="0" b="635"/>
             <wp:docPr id="1075079264" name="Picture 1">
-              <a:hlinkClick xmlns:a="http://schemas.openxmlformats.org/drawingml/2006/main" r:id="rId15"/>
+              <a:hlinkClick xmlns:a="http://schemas.openxmlformats.org/drawingml/2006/main" r:id="rId21"/>
             </wp:docPr>
             <wp:cNvGraphicFramePr>
               <a:graphicFrameLocks xmlns:a="http://schemas.openxmlformats.org/drawingml/2006/main" noChangeAspect="1"/>
@@ -729,12 +869,12 @@
                 <pic:pic xmlns:pic="http://schemas.openxmlformats.org/drawingml/2006/picture">
                   <pic:nvPicPr>
                     <pic:cNvPr id="1075079264" name="Picture 1">
-                      <a:hlinkClick r:id="rId15"/>
+                      <a:hlinkClick r:id="rId21"/>
                     </pic:cNvPr>
                     <pic:cNvPicPr/>
                   </pic:nvPicPr>
                   <pic:blipFill>
-                    <a:blip r:embed="rId16"/>
+                    <a:blip r:embed="rId22"/>
                     <a:stretch>
                       <a:fillRect/>
                     </a:stretch>
@@ -766,7 +906,7 @@
             <wp:extent cx="1006929" cy="683459"/>
             <wp:effectExtent l="0" t="0" r="3175" b="2540"/>
             <wp:docPr id="476231084" name="Picture 1">
-              <a:hlinkClick xmlns:a="http://schemas.openxmlformats.org/drawingml/2006/main" r:id="rId17"/>
+              <a:hlinkClick xmlns:a="http://schemas.openxmlformats.org/drawingml/2006/main" r:id="rId23"/>
             </wp:docPr>
             <wp:cNvGraphicFramePr>
               <a:graphicFrameLocks xmlns:a="http://schemas.openxmlformats.org/drawingml/2006/main" noChangeAspect="1"/>
@@ -776,12 +916,12 @@
                 <pic:pic xmlns:pic="http://schemas.openxmlformats.org/drawingml/2006/picture">
                   <pic:nvPicPr>
                     <pic:cNvPr id="476231084" name="Picture 1">
-                      <a:hlinkClick r:id="rId17"/>
+                      <a:hlinkClick r:id="rId23"/>
                     </pic:cNvPr>
                     <pic:cNvPicPr/>
                   </pic:nvPicPr>
                   <pic:blipFill>
-                    <a:blip r:embed="rId18"/>
+                    <a:blip r:embed="rId24"/>
                     <a:stretch>
                       <a:fillRect/>
                     </a:stretch>

</xml_diff>